<commit_message>
Merchandise, League & More photos
</commit_message>
<xml_diff>
--- a/docs/PB Table Booking instruction.docx
+++ b/docs/PB Table Booking instruction.docx
@@ -87,7 +87,12 @@
       </w:r>
       <w:proofErr w:type="gramEnd"/>
       <w:r>
-        <w:t xml:space="preserve"> prompts to log in. You will need access to your email for the code which is securely generated. Once you are logged into the system, you can top up an amount in your stripe wallet for any number of games. The funds are secured and you only draw down on the balance as funds are used. If sessions are cancelled, funds are refunded back to your wallet.</w:t>
+        <w:t xml:space="preserve"> prompts to log in. You will need access to your email for the code which is securely generated. </w:t>
+      </w:r>
+    </w:p>
+    <w:p>
+      <w:r>
+        <w:t>Once you are logged into the system, you can top up an amount in your stripe wallet for any number of games. The funds are secured and you only draw down on the balance as funds are used. If sessions are cancelled, funds are refunded back to your wallet.</w:t>
       </w:r>
     </w:p>
     <w:p>
@@ -143,7 +148,97 @@
         <w:t xml:space="preserve">Any problems, please </w:t>
       </w:r>
       <w:r>
-        <w:t>email glospickle@gmail.com</w:t>
+        <w:t xml:space="preserve">email </w:t>
+      </w:r>
+      <w:hyperlink r:id="rId5" w:history="1">
+        <w:r>
+          <w:rPr>
+            <w:rStyle w:val="Hyperlink"/>
+          </w:rPr>
+          <w:t>glospickle@gmail.com</w:t>
+        </w:r>
+      </w:hyperlink>
+    </w:p>
+    <w:p/>
+    <w:p>
+      <w:pPr>
+        <w:rPr>
+          <w:b/>
+          <w:bCs/>
+        </w:rPr>
+      </w:pPr>
+      <w:proofErr w:type="gramStart"/>
+      <w:r>
+        <w:t xml:space="preserve">  </w:t>
+      </w:r>
+      <w:r>
+        <w:rPr>
+          <w:rFonts w:ascii="Segoe UI Emoji" w:hAnsi="Segoe UI Emoji" w:cs="Segoe UI Emoji"/>
+        </w:rPr>
+        <w:t>🚨</w:t>
+      </w:r>
+      <w:proofErr w:type="gramEnd"/>
+      <w:r>
+        <w:t xml:space="preserve"> </w:t>
+      </w:r>
+      <w:r>
+        <w:rPr>
+          <w:b/>
+          <w:bCs/>
+        </w:rPr>
+        <w:t>"Bookings open at 9:00 AM on the day following each session."</w:t>
+      </w:r>
+    </w:p>
+    <w:p>
+      <w:proofErr w:type="gramStart"/>
+      <w:r>
+        <w:t xml:space="preserve">  </w:t>
+      </w:r>
+      <w:r>
+        <w:rPr>
+          <w:rFonts w:ascii="Segoe UI Emoji" w:hAnsi="Segoe UI Emoji" w:cs="Segoe UI Emoji"/>
+        </w:rPr>
+        <w:t>💰</w:t>
+      </w:r>
+      <w:proofErr w:type="gramEnd"/>
+      <w:r>
+        <w:t xml:space="preserve"> </w:t>
+      </w:r>
+      <w:r>
+        <w:rPr>
+          <w:b/>
+          <w:bCs/>
+        </w:rPr>
+        <w:t>Ensure money is in your wallet</w:t>
+      </w:r>
+      <w:r>
+        <w:t xml:space="preserve"> before attempting to book a session.</w:t>
+      </w:r>
+    </w:p>
+    <w:p>
+      <w:proofErr w:type="gramStart"/>
+      <w:r>
+        <w:t xml:space="preserve">  </w:t>
+      </w:r>
+      <w:r>
+        <w:rPr>
+          <w:rFonts w:ascii="Segoe UI Emoji" w:hAnsi="Segoe UI Emoji" w:cs="Segoe UI Emoji"/>
+        </w:rPr>
+        <w:t>🛑</w:t>
+      </w:r>
+      <w:proofErr w:type="gramEnd"/>
+      <w:r>
+        <w:t xml:space="preserve"> </w:t>
+      </w:r>
+      <w:r>
+        <w:rPr>
+          <w:b/>
+          <w:bCs/>
+        </w:rPr>
+        <w:t>No funds, no booking</w:t>
+      </w:r>
+      <w:r>
+        <w:t>—sessions cannot be reserved without a wallet balance.</w:t>
       </w:r>
     </w:p>
     <w:p/>

</xml_diff>